<commit_message>
docs: recommit all project documents + cross-reference — 2026-05-31 12:47
</commit_message>
<xml_diff>
--- a/docs/GroupTrack_V25_Manual_CookbookDraft.docx
+++ b/docs/GroupTrack_V25_Manual_CookbookDraft.docx
@@ -2158,6 +2158,45 @@
           <w:szCs w:val="21"/>
         </w:rPr>
         <w:t xml:space="preserve">Default: Trails ON, others OFF. Features display at z12+ (zoom in to see them).</w:t>
+      </w:r>
+    </w:p>
+    <w:p>
+      <w:pPr>
+        <w:pStyle w:val="ListParagraph"/>
+        <w:numPr>
+          <w:ilvl w:val="0"/>
+          <w:numId w:val="2"/>
+        </w:numPr>
+        <w:spacing w:after="60"/>
+      </w:pPr>
+      <w:r>
+        <w:t>SELECTED draws only the items you checked: turn a type to SELECTED, pick specific trails/tracks/waypoints/routes, and the map shows exactly those — now consistent on both the Convoy and Planning maps. (New in this build.)</w:t>
+      </w:r>
+    </w:p>
+    <w:p>
+      <w:pPr>
+        <w:pStyle w:val="ListParagraph"/>
+        <w:numPr>
+          <w:ilvl w:val="0"/>
+          <w:numId w:val="2"/>
+        </w:numPr>
+        <w:spacing w:after="60"/>
+      </w:pPr>
+      <w:r>
+        <w:t>Each map remembers its OWN display selections independently — what you pick on the Convoy map no longer carries over to the Planning map, and each is saved across app restarts. (New in this build — fixes the earlier shared-selection behavior.)</w:t>
+      </w:r>
+    </w:p>
+    <w:p>
+      <w:pPr>
+        <w:pStyle w:val="ListParagraph"/>
+        <w:numPr>
+          <w:ilvl w:val="0"/>
+          <w:numId w:val="2"/>
+        </w:numPr>
+        <w:spacing w:after="60"/>
+      </w:pPr>
+      <w:r>
+        <w:t>Drop a waypoint: long-press the map on empty ground (not on a vehicle marker) — a 12-type picker opens (hazard, gate, water, fuel, shelter, trailhead, viewpoint, campsite, parking, junction, rally, other) with an optional name. The marker drops immediately and appears on both maps. (New in this build.)</w:t>
       </w:r>
     </w:p>
     <w:tbl>

</xml_diff>